<commit_message>
docs: switch report delivery to docx
</commit_message>
<xml_diff>
--- a/artifacts/reports/documents/bucad_report_summary.docx
+++ b/artifacts/reports/documents/bucad_report_summary.docx
@@ -13,7 +13,7 @@
     </w:p>
     <w:p>
       <w:r>
-        <w:t>生成时间：2026-04-23 23:19:49</w:t>
+        <w:t>生成时间：2026-04-23 23:29:38</w:t>
       </w:r>
     </w:p>
     <w:p>
@@ -39,7 +39,172 @@
         <w:pStyle w:val="ListBullet"/>
       </w:pPr>
       <w:r>
-        <w:t>纳入文件：final_validation.md, report_tables.md, threshold_analysis.md, visual_evidence_review.md, release_v1_manifest.md, demo_rehearsal.md, comparison_results.json, busi_eval.json, train_cls_fold1.json, train_seg_fold1.json, busbra_split_summary.json</w:t>
+        <w:t>纳入文件：handbook_progress.md, final_validation.md, report_tables.md, threshold_analysis.md, visual_evidence_review.md, release_v1_manifest.md, demo_rehearsal.md, comparison_results.json, busi_eval.json, train_cls_fold1.json, train_seg_fold1.json, busbra_split_summary.json</w:t>
+      </w:r>
+    </w:p>
+    <w:p>
+      <w:pPr>
+        <w:pStyle w:val="Heading1"/>
+      </w:pPr>
+      <w:r>
+        <w:t>源报告：handbook_progress.md</w:t>
+      </w:r>
+    </w:p>
+    <w:p>
+      <w:pPr>
+        <w:pStyle w:val="Heading1"/>
+      </w:pPr>
+      <w:r>
+        <w:t>开发手册进度同步</w:t>
+      </w:r>
+    </w:p>
+    <w:p>
+      <w:r>
+        <w:t>日期：2026-04-23</w:t>
+      </w:r>
+    </w:p>
+    <w:p>
+      <w:pPr>
+        <w:pStyle w:val="Heading2"/>
+      </w:pPr>
+      <w:r>
+        <w:t>同步依据</w:t>
+      </w:r>
+    </w:p>
+    <w:p>
+      <w:pPr>
+        <w:pStyle w:val="ListBullet"/>
+      </w:pPr>
+      <w:r>
+        <w:t>核心手册：开发手册_V2.md</w:t>
+      </w:r>
+    </w:p>
+    <w:p>
+      <w:pPr>
+        <w:pStyle w:val="ListBullet"/>
+      </w:pPr>
+      <w:r>
+        <w:t>当前任务清单：specs/001-breast-ultrasound-cad/tasks.md</w:t>
+      </w:r>
+    </w:p>
+    <w:p>
+      <w:pPr>
+        <w:pStyle w:val="ListBullet"/>
+      </w:pPr>
+      <w:r>
+        <w:t>当前计划：specs/001-breast-ultrasound-cad/plan.md</w:t>
+      </w:r>
+    </w:p>
+    <w:p>
+      <w:pPr>
+        <w:pStyle w:val="Heading2"/>
+      </w:pPr>
+      <w:r>
+        <w:t>已完成</w:t>
+      </w:r>
+    </w:p>
+    <w:p>
+      <w:pPr>
+        <w:pStyle w:val="ListBullet"/>
+      </w:pPr>
+      <w:r>
+        <w:t>项目基础能力已完成：环境检查、配置加载、BUSBRA/BUSI 数据读取、病例级划分、训练/评估脚本、指标报告、Gradio 演示界面和打包流程。</w:t>
+      </w:r>
+    </w:p>
+    <w:p>
+      <w:pPr>
+        <w:pStyle w:val="ListBullet"/>
+      </w:pPr>
+      <w:r>
+        <w:t>开发手册模型方向已落地：已加入 EfficientNetV2-S 主模型配置、对比实验配置、阈值分析、Grad-CAM 目标层适配、可视化证据导出和批量推理导出。</w:t>
+      </w:r>
+    </w:p>
+    <w:p>
+      <w:pPr>
+        <w:pStyle w:val="ListBullet"/>
+      </w:pPr>
+      <w:r>
+        <w:t>已完成 Phase 7 到 Phase 10 的手册跟进任务：模型质量证据、可视化证据强化、发布准备、阶段性证据冻结。</w:t>
+      </w:r>
+    </w:p>
+    <w:p>
+      <w:pPr>
+        <w:pStyle w:val="ListBullet"/>
+      </w:pPr>
+      <w:r>
+        <w:t>报告交付格式已调整为 Word DOCX：scripts\export_report_documents.py 现在默认只生成 artifacts\reports\documents\bucad_report_summary.docx。</w:t>
+      </w:r>
+    </w:p>
+    <w:p>
+      <w:pPr>
+        <w:pStyle w:val="Heading2"/>
+      </w:pPr>
+      <w:r>
+        <w:t>待完成</w:t>
+      </w:r>
+    </w:p>
+    <w:p>
+      <w:pPr>
+        <w:pStyle w:val="ListBullet"/>
+      </w:pPr>
+      <w:r>
+        <w:t>Phase 11：正式模型证据。需要完成正式实验前置检查、5 折 EfficientNetV2-S 训练、完整模型对比、BUSI 最终外部评估和最终模型/阈值冻结说明。</w:t>
+      </w:r>
+    </w:p>
+    <w:p>
+      <w:pPr>
+        <w:pStyle w:val="ListBullet"/>
+      </w:pPr>
+      <w:r>
+        <w:t>Phase 12：正式可解释性证据。需要整理最终良恶性样例、病灶叠加图、Grad-CAM 热力图和人工审阅记录。</w:t>
+      </w:r>
+    </w:p>
+    <w:p>
+      <w:pPr>
+        <w:pStyle w:val="ListBullet"/>
+      </w:pPr>
+      <w:r>
+        <w:t>Phase 13：发布候选冻结。需要校验最终推理配置、导出最终 release 资产、完成打包演示验证和中文 UI 彩排。</w:t>
+      </w:r>
+    </w:p>
+    <w:p>
+      <w:pPr>
+        <w:pStyle w:val="ListBullet"/>
+      </w:pPr>
+      <w:r>
+        <w:t>Phase 14：报告与答辩包。需要完成最终表格、答辩提纲、常见问答、交接清单和最终验证记录。</w:t>
+      </w:r>
+    </w:p>
+    <w:p>
+      <w:pPr>
+        <w:pStyle w:val="Heading2"/>
+      </w:pPr>
+      <w:r>
+        <w:t>下一步建议</w:t>
+      </w:r>
+    </w:p>
+    <w:p>
+      <w:pPr>
+        <w:pStyle w:val="ListBullet"/>
+      </w:pPr>
+      <w:r>
+        <w:t>先执行 T057 和 T058，确认数据、权重目录、命令清单和实验预算。</w:t>
+      </w:r>
+    </w:p>
+    <w:p>
+      <w:pPr>
+        <w:pStyle w:val="ListBullet"/>
+      </w:pPr>
+      <w:r>
+        <w:t>再执行 T059 到 T062，优先产出正式 EfficientNetV2-S 5 折和 BUSI 最终评估证据。</w:t>
+      </w:r>
+    </w:p>
+    <w:p>
+      <w:pPr>
+        <w:pStyle w:val="ListBullet"/>
+      </w:pPr>
+      <w:r>
+        <w:t>在最终模型冻结后再推进 Phase 12 到 Phase 14，避免视觉证据和报告结论反复改动。</w:t>
       </w:r>
     </w:p>
     <w:p>
@@ -222,7 +387,7 @@
         <w:pStyle w:val="ListBullet"/>
       </w:pPr>
       <w:r>
-        <w:t>Full test suite result after report document export work: 32 passed in 9.11s</w:t>
+        <w:t>Full test suite result after DOCX-only report export sync: 32 passed in 10.37s</w:t>
       </w:r>
     </w:p>
     <w:p>
@@ -511,7 +676,7 @@
         <w:pStyle w:val="ListBullet"/>
       </w:pPr>
       <w:r>
-        <w:t>Added readable DOCX/PDF report export through scripts\export_report_documents.py.</w:t>
+        <w:t>Added readable Word DOCX report export through scripts\export_report_documents.py.</w:t>
       </w:r>
     </w:p>
     <w:p>
@@ -527,15 +692,7 @@
         <w:pStyle w:val="ListBullet"/>
       </w:pPr>
       <w:r>
-        <w:t>Generated artifacts\reports\documents\bucad_report_summary.pdf for direct reading, handoff, and defense preparation.</w:t>
-      </w:r>
-    </w:p>
-    <w:p>
-      <w:pPr>
-        <w:pStyle w:val="ListBullet"/>
-      </w:pPr>
-      <w:r>
-        <w:t>Rendered PDF pages with PyMuPDF for visual spot-checking because pdftoppm and soffice were not available on this Windows environment.</w:t>
+        <w:t>PDF export is intentionally out of scope after the 2026-04-23 delivery decision to use Word documents only.</w:t>
       </w:r>
     </w:p>
     <w:p>
@@ -551,7 +708,15 @@
         <w:pStyle w:val="ListBullet"/>
       </w:pPr>
       <w:r>
-        <w:t>Full regression completed with python -m pytest tests\unit tests\smoke tests\integration: 32 passed in 9.11s.</w:t>
+        <w:t>Full regression completed with python -m pytest tests\unit tests\smoke tests\integration: 32 passed in 10.37s.</w:t>
+      </w:r>
+    </w:p>
+    <w:p>
+      <w:pPr>
+        <w:pStyle w:val="ListBullet"/>
+      </w:pPr>
+      <w:r>
+        <w:t>Development handbook progress was synchronized in artifacts\reports\handbook_progress.md and included in the DOCX report summary.</w:t>
       </w:r>
     </w:p>
     <w:p>

</xml_diff>